<commit_message>
docs: update final project ten-pager
</commit_message>
<xml_diff>
--- a/TEN_PAGER/SpaceMaster_InfiniteEscape_TenPager_CarlosCallagua.docx
+++ b/TEN_PAGER/SpaceMaster_InfiniteEscape_TenPager_CarlosCallagua.docx
@@ -208,6 +208,7 @@
       <w:r>
         <w:rPr>
           <w:rFonts w:ascii="Times New Roman" w:hAnsi="Times New Roman" w:cs="Times New Roman"/>
+          <w:noProof/>
           <w:lang w:val="es-ES_tradnl"/>
         </w:rPr>
         <w:drawing>
@@ -1042,6 +1043,7 @@
       <w:r>
         <w:rPr>
           <w:rFonts w:ascii="Times New Roman" w:hAnsi="Times New Roman" w:cs="Times New Roman"/>
+          <w:noProof/>
           <w:lang w:val="es-ES_tradnl"/>
         </w:rPr>
         <w:drawing>
@@ -1701,6 +1703,7 @@
       <w:r>
         <w:rPr>
           <w:rFonts w:ascii="Arial" w:hAnsi="Arial" w:cs="Arial"/>
+          <w:noProof/>
           <w:lang w:val="es-ES_tradnl"/>
         </w:rPr>
         <w:drawing>
@@ -1817,6 +1820,7 @@
       <w:r>
         <w:rPr>
           <w:rFonts w:ascii="Arial" w:hAnsi="Arial" w:cs="Arial"/>
+          <w:noProof/>
           <w:lang w:val="es-ES_tradnl"/>
         </w:rPr>
         <w:drawing>
@@ -4524,6 +4528,7 @@
       <w:r>
         <w:rPr>
           <w:rFonts w:ascii="Times New Roman" w:hAnsi="Times New Roman" w:cs="Times New Roman"/>
+          <w:noProof/>
           <w:color w:val="000000" w:themeColor="text1"/>
           <w:lang w:val="es-ES_tradnl"/>
         </w:rPr>
@@ -6027,6 +6032,7 @@
       <w:r>
         <w:rPr>
           <w:rFonts w:ascii="Arial" w:hAnsi="Arial" w:cs="Arial"/>
+          <w:noProof/>
           <w:color w:val="FFC000"/>
           <w:lang w:val="es-ES_tradnl"/>
         </w:rPr>
@@ -6094,6 +6100,7 @@
       <w:r>
         <w:rPr>
           <w:rFonts w:ascii="Arial" w:hAnsi="Arial" w:cs="Arial"/>
+          <w:noProof/>
           <w:color w:val="000000" w:themeColor="text1"/>
           <w:lang w:val="es-ES_tradnl"/>
         </w:rPr>
@@ -6224,6 +6231,7 @@
       <w:r>
         <w:rPr>
           <w:rFonts w:ascii="Arial" w:hAnsi="Arial" w:cs="Arial"/>
+          <w:noProof/>
           <w:color w:val="000000" w:themeColor="text1"/>
           <w:lang w:val="es-ES_tradnl"/>
         </w:rPr>
@@ -7136,6 +7144,7 @@
       <w:r>
         <w:rPr>
           <w:rFonts w:ascii="Arial" w:hAnsi="Arial" w:cs="Arial"/>
+          <w:noProof/>
           <w:color w:val="000000" w:themeColor="text1"/>
           <w:lang w:val="es-ES_tradnl"/>
         </w:rPr>
@@ -7243,6 +7252,7 @@
       <w:r>
         <w:rPr>
           <w:rFonts w:ascii="Arial" w:hAnsi="Arial" w:cs="Arial"/>
+          <w:noProof/>
           <w:color w:val="FFC000"/>
           <w:lang w:val="es-ES_tradnl"/>
         </w:rPr>
@@ -7609,13 +7619,7 @@
         <w:rPr>
           <w:rFonts w:ascii="Arial" w:hAnsi="Arial" w:cs="Arial"/>
         </w:rPr>
-        <w:t>O</w:t>
-      </w:r>
-      <w:r>
-        <w:rPr>
-          <w:rFonts w:ascii="Arial" w:hAnsi="Arial" w:cs="Arial"/>
-        </w:rPr>
-        <w:t>ptimización orientada a rendimiento móvil</w:t>
+        <w:t>Optimización orientada a rendimiento móvil</w:t>
       </w:r>
     </w:p>
     <w:p>
@@ -7698,6 +7702,7 @@
       <w:r>
         <w:rPr>
           <w:rFonts w:ascii="Arial" w:hAnsi="Arial" w:cs="Arial"/>
+          <w:noProof/>
           <w:color w:val="000000" w:themeColor="text1"/>
           <w:lang w:val="es-ES_tradnl"/>
         </w:rPr>
@@ -8159,6 +8164,7 @@
       <w:r>
         <w:rPr>
           <w:rFonts w:ascii="Arial" w:hAnsi="Arial" w:cs="Arial"/>
+          <w:noProof/>
           <w:color w:val="000000" w:themeColor="text1"/>
           <w:lang w:val="es-ES_tradnl"/>
         </w:rPr>

</xml_diff>